<commit_message>
Add synthetic dataset, parser fix, analytics model and Power BI view
</commit_message>
<xml_diff>
--- a/data/sample/case_2025_002.docx
+++ b/data/sample/case_2025_002.docx
@@ -7,7 +7,7 @@
         <w:pStyle w:val="Heading1"/>
       </w:pPr>
       <w:r>
-        <w:t>Synthetic Administrative Case Document</w:t>
+        <w:t>Administrative Case Document</w:t>
       </w:r>
     </w:p>
     <w:p>
@@ -17,32 +17,32 @@
     </w:p>
     <w:p>
       <w:r>
-        <w:t>Document Type: Synthetic DOCX</w:t>
+        <w:t>Document Type: Committee Report</w:t>
       </w:r>
     </w:p>
     <w:p>
       <w:r>
-        <w:t>Request Type: Ethics Review</w:t>
+        <w:t>Request Type: Research Project</w:t>
       </w:r>
     </w:p>
     <w:p>
       <w:r>
-        <w:t>Title: Digital Survey for Academic Service Evaluation</w:t>
+        <w:t>Title: Information Systems for Academic Decision-Making</w:t>
       </w:r>
     </w:p>
     <w:p>
       <w:r>
-        <w:t>Applicant: Applicant_004</w:t>
+        <w:t>Applicant: Applicant_002</w:t>
       </w:r>
     </w:p>
     <w:p>
       <w:r>
-        <w:t>Coauthors: Applicant_005</w:t>
+        <w:t xml:space="preserve">Coauthors: </w:t>
       </w:r>
     </w:p>
     <w:p>
       <w:r>
-        <w:t>Advisor: Advisor_002</w:t>
+        <w:t>Advisor: Advisor_010</w:t>
       </w:r>
     </w:p>
     <w:p>
@@ -52,37 +52,37 @@
     </w:p>
     <w:p>
       <w:r>
-        <w:t>Program: Systems Engineering</w:t>
+        <w:t>Program: Industrial Engineering</w:t>
       </w:r>
     </w:p>
     <w:p>
       <w:r>
-        <w:t>Submission Date: 2025-04-05</w:t>
+        <w:t>Submission Date: 2025-04-22</w:t>
       </w:r>
     </w:p>
     <w:p>
       <w:r>
-        <w:t>Review Date: 2025-04-12</w:t>
+        <w:t>Review Date: 2025-05-02</w:t>
       </w:r>
     </w:p>
     <w:p>
       <w:r>
-        <w:t>Decision Date: 2025-04-25</w:t>
+        <w:t xml:space="preserve">Decision Date: </w:t>
       </w:r>
     </w:p>
     <w:p>
       <w:r>
-        <w:t>Status: Approved with observations</w:t>
+        <w:t>Status: Under review</w:t>
       </w:r>
     </w:p>
     <w:p>
       <w:r>
-        <w:t>Result: Approved with minor observations</w:t>
+        <w:t>Result: Under committee review</w:t>
       </w:r>
     </w:p>
     <w:p>
       <w:r>
-        <w:t>Observations: Missing informed consent attachment in first submission</w:t>
+        <w:t>Observations: Budget justification requires additional detail.</w:t>
       </w:r>
     </w:p>
     <w:sectPr>

</xml_diff>